<commit_message>
Agents du Pôle : circulaire 9759 (strict nécessaire, PIA = IPT, Projet avec la circulaire, revue annuelle)
Co-Authored-By: Claude Sonnet 5.5 <noreply@anthropic.com>
</commit_message>
<xml_diff>
--- a/public/modeles-parametrer/modele-agents-pia.docx
+++ b/public/modeles-parametrer/modele-agents-pia.docx
@@ -364,7 +364,7 @@
           <w:sz w:val="24"/>
           <w:szCs w:val="24"/>
         </w:rPr>
-        <w:t xml:space="preserve">Je te donne des codes (E1, E2), jamais de nom, d'adresse ni de date de naissance. Je remets les noms moi-même, hors de cette conversation. Si je colle des données identifiantes, arrête-toi et dis-le-moi.</w:t>
+        <w:t xml:space="preserve">Je te donne des codes (E1, E2), jamais de nom, d'adresse ni de date de naissance. Je remets les noms moi-même, hors de cette conversation. Ne demande que le strict nécessaire. Si je colle des données identifiantes, arrête-toi et dis-le-moi.</w:t>
       </w:r>
     </w:p>
     <w:p>
@@ -450,7 +450,7 @@
           <w:sz w:val="24"/>
           <w:szCs w:val="24"/>
         </w:rPr>
-        <w:t xml:space="preserve">Trame utilisée : </w:t>
+        <w:t xml:space="preserve">Un PIA concerne un élève en IPT (sinon : protocole AR) : demande lequel s'applique. Trame : </w:t>
       </w:r>
       <w:r>
         <w:rPr>

</xml_diff>